<commit_message>
admin and arduino water changes level
</commit_message>
<xml_diff>
--- a/Printables/HOW TO USE.docx
+++ b/Printables/HOW TO USE.docx
@@ -3,6 +3,12 @@
 <w:document xmlns:wpc="http://schemas.microsoft.com/office/word/2010/wordprocessingCanvas" xmlns:cx="http://schemas.microsoft.com/office/drawing/2014/chartex" xmlns:cx1="http://schemas.microsoft.com/office/drawing/2015/9/8/chartex" xmlns:cx2="http://schemas.microsoft.com/office/drawing/2015/10/21/chartex" xmlns:cx3="http://schemas.microsoft.com/office/drawing/2016/5/9/chartex" xmlns:cx4="http://schemas.microsoft.com/office/drawing/2016/5/10/chartex" xmlns:cx5="http://schemas.microsoft.com/office/drawing/2016/5/11/chartex" xmlns:cx6="http://schemas.microsoft.com/office/drawing/2016/5/12/chartex" xmlns:cx7="http://schemas.microsoft.com/office/drawing/2016/5/13/chartex" xmlns:cx8="http://schemas.microsoft.com/office/drawing/2016/5/14/chartex" xmlns:mc="http://schemas.openxmlformats.org/markup-compatibility/2006" xmlns:aink="http://schemas.microsoft.com/office/drawing/2016/ink" xmlns:am3d="http://schemas.microsoft.com/office/drawing/2017/model3d" xmlns:o="urn:schemas-microsoft-com:office:office" xmlns:oel="http://schemas.microsoft.com/office/2019/extlst" xmlns:r="http://schemas.openxmlformats.org/officeDocument/2006/relationships" xmlns:m="http://schemas.openxmlformats.org/officeDocument/2006/math" xmlns:v="urn:schemas-microsoft-com:vml" xmlns:wp14="http://schemas.microsoft.com/office/word/2010/wordprocessingDrawing" xmlns:wp="http://schemas.openxmlformats.org/drawingml/2006/wordprocessingDrawing" xmlns:w10="urn:schemas-microsoft-com:office:word" xmlns:w="http://schemas.openxmlformats.org/wordprocessingml/2006/main" xmlns:w14="http://schemas.microsoft.com/office/word/2010/wordml" xmlns:w15="http://schemas.microsoft.com/office/word/2012/wordml" xmlns:w16cex="http://schemas.microsoft.com/office/word/2018/wordml/cex" xmlns:w16cid="http://schemas.microsoft.com/office/word/2016/wordml/cid" xmlns:w16="http://schemas.microsoft.com/office/word/2018/wordml" xmlns:w16sdtdh="http://schemas.microsoft.com/office/word/2020/wordml/sdtdatahash" xmlns:w16se="http://schemas.microsoft.com/office/word/2015/wordml/symex" xmlns:wpg="http://schemas.microsoft.com/office/word/2010/wordprocessingGroup" xmlns:wpi="http://schemas.microsoft.com/office/word/2010/wordprocessingInk" xmlns:wne="http://schemas.microsoft.com/office/word/2006/wordml" xmlns:wps="http://schemas.microsoft.com/office/word/2010/wordprocessingShape" mc:Ignorable="w14 w15 w16se w16cid w16 w16cex w16sdtdh wp14">
   <w:body>
     <w:p>
+      <w:pPr>
+        <w:rPr>
+          <w:b/>
+          <w:bCs/>
+        </w:rPr>
+      </w:pPr>
       <w:r>
         <w:rPr>
           <w:rFonts w:ascii="Segoe UI Emoji" w:hAnsi="Segoe UI Emoji" w:cs="Segoe UI Emoji"/>
@@ -11,10 +17,10 @@
           <w:noProof/>
         </w:rPr>
         <w:drawing>
-          <wp:inline distT="0" distB="0" distL="0" distR="0" wp14:anchorId="05270056" wp14:editId="3E8DFEA6">
-            <wp:extent cx="6240780" cy="4160520"/>
-            <wp:effectExtent l="0" t="0" r="7620" b="0"/>
-            <wp:docPr id="2" name="Picture 2"/>
+          <wp:inline distT="0" distB="0" distL="0" distR="0" wp14:anchorId="679819DB" wp14:editId="07F3BC28">
+            <wp:extent cx="5257800" cy="5399405"/>
+            <wp:effectExtent l="0" t="0" r="0" b="0"/>
+            <wp:docPr id="4" name="Picture 4"/>
             <wp:cNvGraphicFramePr>
               <a:graphicFrameLocks xmlns:a="http://schemas.openxmlformats.org/drawingml/2006/main" noChangeAspect="1"/>
             </wp:cNvGraphicFramePr>
@@ -22,13 +28,13 @@
               <a:graphicData uri="http://schemas.openxmlformats.org/drawingml/2006/picture">
                 <pic:pic xmlns:pic="http://schemas.openxmlformats.org/drawingml/2006/picture">
                   <pic:nvPicPr>
-                    <pic:cNvPr id="0" name="Picture 20"/>
+                    <pic:cNvPr id="0" name="Picture 2"/>
                     <pic:cNvPicPr>
                       <a:picLocks noChangeAspect="1" noChangeArrowheads="1"/>
                     </pic:cNvPicPr>
                   </pic:nvPicPr>
                   <pic:blipFill>
-                    <a:blip r:embed="rId5" cstate="print">
+                    <a:blip r:embed="rId5">
                       <a:extLst>
                         <a:ext uri="{28A0092B-C50C-407E-A947-70E740481C1C}">
                           <a14:useLocalDpi xmlns:a14="http://schemas.microsoft.com/office/drawing/2010/main" val="0"/>
@@ -43,7 +49,7 @@
                   <pic:spPr bwMode="auto">
                     <a:xfrm>
                       <a:off x="0" y="0"/>
-                      <a:ext cx="6240780" cy="4160520"/>
+                      <a:ext cx="5257800" cy="5399405"/>
                     </a:xfrm>
                     <a:prstGeom prst="rect">
                       <a:avLst/>
@@ -1193,6 +1199,7 @@
   <w:style w:type="character" w:default="1" w:styleId="DefaultParagraphFont">
     <w:name w:val="Default Paragraph Font"/>
     <w:uiPriority w:val="1"/>
+    <w:semiHidden/>
     <w:unhideWhenUsed/>
   </w:style>
   <w:style w:type="table" w:default="1" w:styleId="TableNormal">

</xml_diff>